<commit_message>
Auto-extracted Arabic text from existing PDFs
</commit_message>
<xml_diff>
--- a/output/s_clean.docx
+++ b/output/s_clean.docx
@@ -10,7 +10,7 @@
         <w:rPr>
           <w:sz w:val="26"/>
         </w:rPr>
-        <w:t>المقدمة: عماد</w:t>
+        <w:t>جدول تقييم العروض التقديمية للطلاب</w:t>
       </w:r>
     </w:p>
     <w:p>
@@ -21,7 +21,7 @@
         <w:rPr>
           <w:sz w:val="26"/>
         </w:rPr>
-        <w:t>السلام عليكم.. مرحباً كيفكم شباب؟ الجو اليوم حلوء أو والله محاضرة الدكتور كانت</w:t>
+        <w:t>مخصص ل: د. مزنة</w:t>
       </w:r>
     </w:p>
     <w:p>
@@ -32,7 +32,7 @@
         <w:rPr>
           <w:sz w:val="26"/>
         </w:rPr>
-        <w:t>دسمة اليوم وحلوة.. كيف كان صباحكم اليوم؟</w:t>
+        <w:t>التاريخ: الاثنين 11 أيار 2026 - الموضوع: شركة كيا (18ك1)</w:t>
       </w:r>
     </w:p>
     <w:p>
@@ -43,7 +43,7 @@
         <w:rPr>
           <w:sz w:val="26"/>
         </w:rPr>
-        <w:t>[مرحلة كسر الجليد مع الطلاب]</w:t>
+        <w:t>اسم الطالب العلامة /15 التعليقات</w:t>
       </w:r>
     </w:p>
     <w:p>
@@ -54,7 +54,7 @@
         <w:rPr>
           <w:sz w:val="26"/>
         </w:rPr>
-        <w:t>شباب لحنا منسمع كتير بالعلاقات العامة, بس بحس أحياناً الناس بتخربط بينها وبين</w:t>
+        <w:t>محمد ريبال كفتارو</w:t>
       </w:r>
     </w:p>
     <w:p>
@@ -65,7 +65,7 @@
         <w:rPr>
           <w:sz w:val="26"/>
         </w:rPr>
-        <w:t>التسويق أو الإعلان. برأيكم شو الرابط بيناتهم أو المشترك؟ وشو هو الفرق الجوهري؟!</w:t>
+        <w:t>أحمد العسلي</w:t>
       </w:r>
     </w:p>
     <w:p>
@@ -76,7 +76,7 @@
         <w:rPr>
           <w:sz w:val="26"/>
         </w:rPr>
-        <w:t>[استماع ل 2 أو 3 طلاب]</w:t>
+        <w:t>إبراهيم رداوي</w:t>
       </w:r>
     </w:p>
     <w:p>
@@ -87,7 +87,7 @@
         <w:rPr>
           <w:sz w:val="26"/>
         </w:rPr>
-        <w:t>تمام, ففكرة العلاقات العامة مبنية على ربط الجمهور مع المؤسسة بشكل مستدام,</w:t>
+        <w:t>حمزة عمراني</w:t>
       </w:r>
     </w:p>
     <w:p>
@@ -98,7 +98,7 @@
         <w:rPr>
           <w:sz w:val="26"/>
         </w:rPr>
-        <w:t>وبتفرق عن الإعلان بالشفافية (/1180503/600) والوضوح الكامل مع الجمهور.</w:t>
+        <w:t>التاريخ: الاثنين 11 أيار 2026 - الموضوع: شركة زارا (285868)</w:t>
       </w:r>
     </w:p>
     <w:p>
@@ -109,7 +109,7 @@
         <w:rPr>
           <w:sz w:val="26"/>
         </w:rPr>
-        <w:t>هلق أكيد لنستخدم العلاقات العامة بدنا أدوات. برأيكم كيف سامسونج وأبل وهي</w:t>
+        <w:t>اسم الطالب العلامة /15 التعليقات</w:t>
       </w:r>
     </w:p>
     <w:p>
@@ -120,7 +120,7 @@
         <w:rPr>
           <w:sz w:val="26"/>
         </w:rPr>
-        <w:t>الشركات المشهورة بتستخدم العلاقات العامة لتقوم بالتواصل مع الجمهور؟</w:t>
+        <w:t>جويل بردويل</w:t>
       </w:r>
     </w:p>
     <w:p>
@@ -131,7 +131,7 @@
         <w:rPr>
           <w:sz w:val="26"/>
         </w:rPr>
-        <w:t>[دقيقتين للمناقشة بين الطلاب مع الشكر]</w:t>
+        <w:t>شام توتونجي</w:t>
       </w:r>
     </w:p>
     <w:p>
@@ -142,7 +142,7 @@
         <w:rPr>
           <w:sz w:val="26"/>
         </w:rPr>
-        <w:t>حدا سمعان بمصيبة سامسونج بال 7 ؟ تفجير بطاريات ال 7 016ل المفاجئ.. وشو</w:t>
+        <w:t>ليليان طحان</w:t>
       </w:r>
     </w:p>
     <w:p>
@@ -153,7 +153,7 @@
         <w:rPr>
           <w:sz w:val="26"/>
         </w:rPr>
-        <w:t>الأداة يلي استخدمتها برأيكم؟ هل هي (أداة إدارة الأزمات) ولا (أداة العلاقات العامة</w:t>
+        <w:t>محمد هارون</w:t>
       </w:r>
     </w:p>
     <w:p>
@@ -164,7 +164,7 @@
         <w:rPr>
           <w:sz w:val="26"/>
         </w:rPr>
-        <w:t>الإعلامية)؟</w:t>
+        <w:t>التاريخ: الاثنين 18 أيار 2026 - الموضوع: شركة تويوتا (018/ا710)</w:t>
       </w:r>
     </w:p>
     <w:p>
@@ -175,7 +175,7 @@
         <w:rPr>
           <w:sz w:val="26"/>
         </w:rPr>
-        <w:t>[إجابة من طالب مع شكر]</w:t>
+        <w:t>اسم الطالب العلامة /15 التعليقات</w:t>
       </w:r>
     </w:p>
     <w:p>
@@ -186,7 +186,7 @@
         <w:rPr>
           <w:sz w:val="26"/>
         </w:rPr>
-        <w:t>تمام, إدارة الأزمات: لأن بهديك الفترة سامسونج قدمت اعتذارات وسحبت كل أجهزة</w:t>
+        <w:t>أحمد بيرم</w:t>
       </w:r>
     </w:p>
     <w:p>
@@ -197,7 +197,7 @@
         <w:rPr>
           <w:sz w:val="26"/>
         </w:rPr>
-        <w:t>ال 7 ‎١/016‏ من السوق, وحتى دفعت أموال كتير كرمال توضح المشكلة للجمهور وتحافظ</w:t>
+        <w:t>وديع بطحيش</w:t>
       </w:r>
     </w:p>
     <w:p>
@@ -208,7 +208,7 @@
         <w:rPr>
           <w:sz w:val="26"/>
         </w:rPr>
-        <w:t>هلق لما منشوف مؤتمر سنوي لشركة أبل أو سامسونج بالأسواق.: شو الأداة من</w:t>
+        <w:t>رامي الحلاق</w:t>
       </w:r>
     </w:p>
     <w:p>
@@ -219,7 +219,7 @@
         <w:rPr>
           <w:sz w:val="26"/>
         </w:rPr>
-        <w:t>العلاقات العامة الي عم يستخدموها هون؟ هل هي إدارة الأزمات ولا الإدارة الإعلامية؟</w:t>
+        <w:t>عماد الدين النسمة</w:t>
       </w:r>
     </w:p>
     <w:p>
@@ -230,7 +230,7 @@
         <w:rPr>
           <w:sz w:val="26"/>
         </w:rPr>
-        <w:t>ممتاز. الإدارة الإعلامية: والسبب مو بس مشان تعرض منتجاتها. هي مشان تفرجي</w:t>
+        <w:t>التاريخ: الاثنين 18 أيار 2026 - الموضوع: 5اع01!] ‎!١/13111016‏</w:t>
       </w:r>
     </w:p>
     <w:p>
@@ -241,7 +241,7 @@
         <w:rPr>
           <w:sz w:val="26"/>
         </w:rPr>
-        <w:t>قوتها إعلامياً وتثبت جودتها ومكانتها بالسوق وتوصل رسالة إنو "ما في منافس حقيقي"</w:t>
+        <w:t>‏اسم الطالب العلامة /15 التعليقات</w:t>
       </w:r>
     </w:p>
     <w:p>
@@ -252,7 +252,7 @@
         <w:rPr>
           <w:sz w:val="26"/>
         </w:rPr>
-        <w:t>في الختام, لازم نؤكد إنو أدوات العلاقات العامة مو مجرد وسيلة تواصل. هي</w:t>
+        <w:t>ساره فدح</w:t>
       </w:r>
     </w:p>
     <w:p>
@@ -263,7 +263,7 @@
         <w:rPr>
           <w:sz w:val="26"/>
         </w:rPr>
-        <w:t>"استراتيجية كاملة" بتهدف لبناء علاقة طويلة الأمد مع الجمهور. من خلال إدارة</w:t>
+        <w:t>طاهر الحمود</w:t>
       </w:r>
     </w:p>
     <w:p>
@@ -274,7 +274,7 @@
         <w:rPr>
           <w:sz w:val="26"/>
         </w:rPr>
-        <w:t>الأزمات, المنظمة بتحمي سمعتها بالوقت الصعبء, ومن خلال الإدارة الإعلامية,</w:t>
+        <w:t>التاريخ: الاثنين 18 أيار 2026 - الموضوع: عرض تقديمي</w:t>
       </w:r>
     </w:p>
     <w:p>
@@ -285,7 +285,7 @@
         <w:rPr>
           <w:sz w:val="26"/>
         </w:rPr>
-        <w:t>بتعزز صورتها الذهنية وقوتها بالسوق. التحدي الحقيقي للعلاقات العامة هو الحفاظ على</w:t>
+        <w:t>اسم الطالب العلامة /15 التعليقات</w:t>
       </w:r>
     </w:p>
     <w:p>
@@ -296,7 +296,7 @@
         <w:rPr>
           <w:sz w:val="26"/>
         </w:rPr>
-        <w:t>الصدق والشفافية, لأنها هي الضمانة الوحيدة لاستمرار ثقة الناس بالمؤسسة مهما</w:t>
+        <w:t>ريماز ابو خبصة</w:t>
       </w:r>
     </w:p>
     <w:p>
@@ -307,7 +307,7 @@
         <w:rPr>
           <w:sz w:val="26"/>
         </w:rPr>
-        <w:t>كانت الظروف.</w:t>
+        <w:t>وليد محسن</w:t>
       </w:r>
     </w:p>
     <w:p>
@@ -318,7 +318,161 @@
         <w:rPr>
           <w:sz w:val="26"/>
         </w:rPr>
-        <w:t>كل الشكر لحسن استماعكم, ورح ننتقل هلق لبقية الأفكار مع الزملاء..</w:t>
+        <w:t>التاريخ: الاثنين 18 أيار 2026 - الموضوع: عرض تقديمي</w:t>
+      </w:r>
+    </w:p>
+    <w:p>
+      <w:pPr>
+        <w:jc w:val="right"/>
+      </w:pPr>
+      <w:r>
+        <w:rPr>
+          <w:sz w:val="26"/>
+        </w:rPr>
+        <w:t>اسم الطالب العلامة /15 التعليقات</w:t>
+      </w:r>
+    </w:p>
+    <w:p>
+      <w:pPr>
+        <w:jc w:val="right"/>
+      </w:pPr>
+      <w:r>
+        <w:rPr>
+          <w:sz w:val="26"/>
+        </w:rPr>
+        <w:t>سامي العقاد</w:t>
+      </w:r>
+    </w:p>
+    <w:p>
+      <w:pPr>
+        <w:jc w:val="right"/>
+      </w:pPr>
+      <w:r>
+        <w:rPr>
+          <w:sz w:val="26"/>
+        </w:rPr>
+        <w:t>عبد المالك ناجي</w:t>
+      </w:r>
+    </w:p>
+    <w:p>
+      <w:pPr>
+        <w:jc w:val="right"/>
+      </w:pPr>
+      <w:r>
+        <w:rPr>
+          <w:sz w:val="26"/>
+        </w:rPr>
+        <w:t>رقية صبرا</w:t>
+      </w:r>
+    </w:p>
+    <w:p>
+      <w:pPr>
+        <w:jc w:val="right"/>
+      </w:pPr>
+      <w:r>
+        <w:rPr>
+          <w:sz w:val="26"/>
+        </w:rPr>
+        <w:t>التاريخ: الاثنين 25 أيار 2026 - الموضوع: عرض تقديمي</w:t>
+      </w:r>
+    </w:p>
+    <w:p>
+      <w:pPr>
+        <w:jc w:val="right"/>
+      </w:pPr>
+      <w:r>
+        <w:rPr>
+          <w:sz w:val="26"/>
+        </w:rPr>
+        <w:t>اسم الطالب العلامة /15 التعليقات</w:t>
+      </w:r>
+    </w:p>
+    <w:p>
+      <w:pPr>
+        <w:jc w:val="right"/>
+      </w:pPr>
+      <w:r>
+        <w:rPr>
+          <w:sz w:val="26"/>
+        </w:rPr>
+        <w:t>علي يوسف</w:t>
+      </w:r>
+    </w:p>
+    <w:p>
+      <w:pPr>
+        <w:jc w:val="right"/>
+      </w:pPr>
+      <w:r>
+        <w:rPr>
+          <w:sz w:val="26"/>
+        </w:rPr>
+        <w:t>خالد الشبلخ</w:t>
+      </w:r>
+    </w:p>
+    <w:p>
+      <w:pPr>
+        <w:jc w:val="right"/>
+      </w:pPr>
+      <w:r>
+        <w:rPr>
+          <w:sz w:val="26"/>
+        </w:rPr>
+        <w:t>بيان</w:t>
+      </w:r>
+    </w:p>
+    <w:p>
+      <w:pPr>
+        <w:jc w:val="right"/>
+      </w:pPr>
+      <w:r>
+        <w:rPr>
+          <w:sz w:val="26"/>
+        </w:rPr>
+        <w:t>التاريخ: الاثنين 25 أيار 2026 - الموضوع: عرض تقديمي</w:t>
+      </w:r>
+    </w:p>
+    <w:p>
+      <w:pPr>
+        <w:jc w:val="right"/>
+      </w:pPr>
+      <w:r>
+        <w:rPr>
+          <w:sz w:val="26"/>
+        </w:rPr>
+        <w:t>اسم الطالب العلامة /15 التعليقات</w:t>
+      </w:r>
+    </w:p>
+    <w:p>
+      <w:pPr>
+        <w:jc w:val="right"/>
+      </w:pPr>
+      <w:r>
+        <w:rPr>
+          <w:sz w:val="26"/>
+        </w:rPr>
+        <w:t>التاريخ: الاثنين 25 أيار 2026 - الموضوع: عرض تقديمي</w:t>
+      </w:r>
+    </w:p>
+    <w:p>
+      <w:pPr>
+        <w:jc w:val="right"/>
+      </w:pPr>
+      <w:r>
+        <w:rPr>
+          <w:sz w:val="26"/>
+        </w:rPr>
+        <w:t>اسم الطالب العلامة /15 التعليقات</w:t>
+      </w:r>
+    </w:p>
+    <w:p>
+      <w:pPr>
+        <w:jc w:val="right"/>
+      </w:pPr>
+      <w:r>
+        <w:rPr>
+          <w:sz w:val="26"/>
+        </w:rPr>
+        <w:t>الكاتب: عماد</w:t>
       </w:r>
     </w:p>
     <w:sectPr>

</xml_diff>